<commit_message>
update: modify 高级Web实验及实验报告 document
</commit_message>
<xml_diff>
--- a/实验/2026/关于高级Web实验及实验报告.docx
+++ b/实验/2026/关于高级Web实验及实验报告.docx
@@ -62,13 +62,9 @@
     </w:p>
     <w:p>
       <w:pPr>
-        <w:pStyle w:val="3"/>
-        <w:shd w:val="clear" w:color="auto" w:fill="FFFFFF"/>
-        <w:spacing w:beforeAutospacing="0" w:afterAutospacing="0" w:line="25" w:lineRule="atLeast"/>
-        <w:rPr>
-          <w:rFonts w:ascii="仿宋" w:eastAsia="仿宋" w:hAnsi="仿宋" w:hint="default"/>
-          <w:sz w:val="32"/>
-          <w:szCs w:val="32"/>
+        <w:pStyle w:val="p1"/>
+        <w:rPr>
+          <w:rFonts w:hint="eastAsia"/>
         </w:rPr>
       </w:pPr>
       <w:r>
@@ -77,30 +73,13 @@
           <w:sz w:val="32"/>
           <w:szCs w:val="32"/>
         </w:rPr>
-        <w:t xml:space="preserve">题目一 </w:t>
-      </w:r>
-      <w:r>
-        <w:rPr>
-          <w:rFonts w:ascii="仿宋" w:eastAsia="仿宋" w:hAnsi="仿宋" w:cs="宋体"/>
-          <w:sz w:val="32"/>
-          <w:szCs w:val="32"/>
-        </w:rPr>
-        <w:t>个人信息卡片</w:t>
-      </w:r>
-      <w:r>
-        <w:rPr>
-          <w:rFonts w:ascii="仿宋" w:eastAsia="仿宋" w:hAnsi="仿宋"/>
-          <w:sz w:val="32"/>
-          <w:szCs w:val="32"/>
-        </w:rPr>
-        <w:t>：</w:t>
+        <w:t>题目一 个人信息卡片：</w:t>
       </w:r>
       <w:hyperlink r:id="rId4" w:history="1">
         <w:r>
           <w:rPr>
             <w:rStyle w:val="a4"/>
             <w:rFonts w:ascii="仿宋" w:eastAsia="仿宋" w:hAnsi="仿宋"/>
-            <w:color w:val="auto"/>
             <w:sz w:val="32"/>
             <w:szCs w:val="32"/>
           </w:rPr>
@@ -110,7 +89,15 @@
           <w:rPr>
             <w:rStyle w:val="a4"/>
             <w:rFonts w:ascii="仿宋" w:eastAsia="仿宋" w:hAnsi="仿宋"/>
-            <w:color w:val="auto"/>
+            <w:sz w:val="32"/>
+            <w:szCs w:val="32"/>
+          </w:rPr>
+          <w:br/>
+        </w:r>
+        <w:r>
+          <w:rPr>
+            <w:rStyle w:val="a4"/>
+            <w:rFonts w:ascii="仿宋" w:eastAsia="仿宋" w:hAnsi="仿宋"/>
             <w:sz w:val="32"/>
             <w:szCs w:val="32"/>
           </w:rPr>
@@ -123,7 +110,23 @@
           <w:sz w:val="32"/>
           <w:szCs w:val="32"/>
         </w:rPr>
-        <w:t>题目二 简易版微博：</w:t>
+        <w:t>题目</w:t>
+      </w:r>
+      <w:r>
+        <w:rPr>
+          <w:rFonts w:ascii="仿宋" w:eastAsia="仿宋" w:hAnsi="仿宋" w:hint="eastAsia"/>
+          <w:sz w:val="32"/>
+          <w:szCs w:val="32"/>
+        </w:rPr>
+        <w:t>二</w:t>
+      </w:r>
+      <w:r>
+        <w:rPr>
+          <w:rFonts w:ascii="仿宋" w:eastAsia="仿宋" w:hAnsi="仿宋"/>
+          <w:sz w:val="32"/>
+          <w:szCs w:val="32"/>
+        </w:rPr>
+        <w:t xml:space="preserve"> 简易版微博：</w:t>
       </w:r>
       <w:hyperlink r:id="rId5" w:history="1">
         <w:r>
@@ -140,7 +143,9 @@
     <w:p>
       <w:pPr>
         <w:rPr>
-          <w:rFonts w:hint="eastAsia"/>
+          <w:rFonts w:ascii="仿宋" w:eastAsia="仿宋" w:hAnsi="仿宋" w:hint="eastAsia"/>
+          <w:sz w:val="32"/>
+          <w:szCs w:val="32"/>
           <w:lang w:eastAsia="zh-CN"/>
         </w:rPr>
       </w:pPr>
@@ -148,7 +153,296 @@
     <w:p>
       <w:pPr>
         <w:rPr>
-          <w:rFonts w:ascii="仿宋" w:eastAsia="仿宋" w:hAnsi="仿宋"/>
+          <w:rFonts w:ascii="仿宋" w:eastAsia="仿宋" w:hAnsi="仿宋" w:hint="eastAsia"/>
+          <w:sz w:val="32"/>
+          <w:szCs w:val="32"/>
+          <w:lang w:eastAsia="zh-CN"/>
+        </w:rPr>
+      </w:pPr>
+      <w:r>
+        <w:rPr>
+          <w:rFonts w:ascii="仿宋" w:eastAsia="仿宋" w:hAnsi="仿宋" w:hint="eastAsia"/>
+          <w:sz w:val="32"/>
+          <w:szCs w:val="32"/>
+          <w:lang w:eastAsia="zh-CN"/>
+        </w:rPr>
+        <w:t>实验环境</w:t>
+      </w:r>
+      <w:r>
+        <w:rPr>
+          <w:rFonts w:ascii="仿宋" w:eastAsia="仿宋" w:hAnsi="仿宋" w:hint="eastAsia"/>
+          <w:sz w:val="32"/>
+          <w:szCs w:val="32"/>
+          <w:lang w:eastAsia="zh-CN"/>
+        </w:rPr>
+        <w:t>：</w:t>
+      </w:r>
+      <w:r>
+        <w:rPr>
+          <w:rFonts w:ascii="仿宋" w:eastAsia="仿宋" w:hAnsi="仿宋" w:hint="eastAsia"/>
+          <w:sz w:val="32"/>
+          <w:szCs w:val="32"/>
+          <w:lang w:eastAsia="zh-CN"/>
+        </w:rPr>
+        <w:t>本次实验</w:t>
+      </w:r>
+      <w:r>
+        <w:rPr>
+          <w:rFonts w:ascii="仿宋" w:eastAsia="仿宋" w:hAnsi="仿宋" w:hint="eastAsia"/>
+          <w:sz w:val="32"/>
+          <w:szCs w:val="32"/>
+          <w:lang w:eastAsia="zh-CN"/>
+        </w:rPr>
+        <w:t>依托</w:t>
+      </w:r>
+      <w:r>
+        <w:rPr>
+          <w:rFonts w:ascii="仿宋" w:eastAsia="仿宋" w:hAnsi="仿宋"/>
+          <w:sz w:val="32"/>
+          <w:szCs w:val="32"/>
+          <w:lang w:eastAsia="zh-CN"/>
+        </w:rPr>
+        <w:t>GitHub</w:t>
+      </w:r>
+      <w:r>
+        <w:rPr>
+          <w:rFonts w:ascii="仿宋" w:eastAsia="仿宋" w:hAnsi="仿宋" w:hint="eastAsia"/>
+          <w:sz w:val="32"/>
+          <w:szCs w:val="32"/>
+          <w:lang w:eastAsia="zh-CN"/>
+        </w:rPr>
+        <w:t xml:space="preserve"> Classroom</w:t>
+      </w:r>
+      <w:r>
+        <w:rPr>
+          <w:rFonts w:ascii="仿宋" w:eastAsia="仿宋" w:hAnsi="仿宋" w:hint="eastAsia"/>
+          <w:sz w:val="32"/>
+          <w:szCs w:val="32"/>
+          <w:lang w:eastAsia="zh-CN"/>
+        </w:rPr>
+        <w:t>平台</w:t>
+      </w:r>
+      <w:r>
+        <w:rPr>
+          <w:rFonts w:ascii="仿宋" w:eastAsia="仿宋" w:hAnsi="仿宋" w:hint="eastAsia"/>
+          <w:sz w:val="32"/>
+          <w:szCs w:val="32"/>
+          <w:lang w:eastAsia="zh-CN"/>
+        </w:rPr>
+        <w:t>进行</w:t>
+      </w:r>
+      <w:r>
+        <w:rPr>
+          <w:rFonts w:ascii="仿宋" w:eastAsia="仿宋" w:hAnsi="仿宋" w:hint="eastAsia"/>
+          <w:sz w:val="32"/>
+          <w:szCs w:val="32"/>
+          <w:lang w:eastAsia="zh-CN"/>
+        </w:rPr>
+        <w:t>。</w:t>
+      </w:r>
+      <w:r>
+        <w:rPr>
+          <w:rFonts w:ascii="仿宋" w:eastAsia="仿宋" w:hAnsi="仿宋" w:hint="eastAsia"/>
+          <w:sz w:val="32"/>
+          <w:szCs w:val="32"/>
+          <w:lang w:eastAsia="zh-CN"/>
+        </w:rPr>
+        <w:t>注册好了个人的Github账号后，</w:t>
+      </w:r>
+      <w:r>
+        <w:rPr>
+          <w:rFonts w:ascii="仿宋" w:eastAsia="仿宋" w:hAnsi="仿宋" w:hint="eastAsia"/>
+          <w:sz w:val="32"/>
+          <w:szCs w:val="32"/>
+          <w:lang w:eastAsia="zh-CN"/>
+        </w:rPr>
+        <w:t>请点击接收上面的作业，</w:t>
+      </w:r>
+      <w:r>
+        <w:rPr>
+          <w:rFonts w:ascii="仿宋" w:eastAsia="仿宋" w:hAnsi="仿宋" w:hint="eastAsia"/>
+          <w:sz w:val="32"/>
+          <w:szCs w:val="32"/>
+          <w:lang w:eastAsia="zh-CN"/>
+        </w:rPr>
+        <w:t>作业内容请直接在仓库里面查看</w:t>
+      </w:r>
+      <w:r>
+        <w:rPr>
+          <w:rFonts w:ascii="仿宋" w:eastAsia="仿宋" w:hAnsi="仿宋" w:hint="eastAsia"/>
+          <w:sz w:val="32"/>
+          <w:szCs w:val="32"/>
+          <w:lang w:eastAsia="zh-CN"/>
+        </w:rPr>
+        <w:t>。第一个</w:t>
+      </w:r>
+      <w:r>
+        <w:rPr>
+          <w:rFonts w:ascii="仿宋" w:eastAsia="仿宋" w:hAnsi="仿宋" w:hint="eastAsia"/>
+          <w:sz w:val="32"/>
+          <w:szCs w:val="32"/>
+          <w:lang w:eastAsia="zh-CN"/>
+        </w:rPr>
+        <w:t>题目</w:t>
+      </w:r>
+      <w:r>
+        <w:rPr>
+          <w:rFonts w:ascii="仿宋" w:eastAsia="仿宋" w:hAnsi="仿宋" w:hint="eastAsia"/>
+          <w:sz w:val="32"/>
+          <w:szCs w:val="32"/>
+          <w:lang w:eastAsia="zh-CN"/>
+        </w:rPr>
+        <w:t>和第二个</w:t>
+      </w:r>
+      <w:r>
+        <w:rPr>
+          <w:rFonts w:ascii="仿宋" w:eastAsia="仿宋" w:hAnsi="仿宋" w:hint="eastAsia"/>
+          <w:sz w:val="32"/>
+          <w:szCs w:val="32"/>
+          <w:lang w:eastAsia="zh-CN"/>
+        </w:rPr>
+        <w:t>题目</w:t>
+      </w:r>
+      <w:r>
+        <w:rPr>
+          <w:rFonts w:ascii="仿宋" w:eastAsia="仿宋" w:hAnsi="仿宋" w:hint="eastAsia"/>
+          <w:sz w:val="32"/>
+          <w:szCs w:val="32"/>
+          <w:lang w:eastAsia="zh-CN"/>
+        </w:rPr>
+        <w:t>除了仓库中除了实验说明文档和</w:t>
+      </w:r>
+      <w:r>
+        <w:rPr>
+          <w:rFonts w:ascii="仿宋" w:eastAsia="仿宋" w:hAnsi="仿宋" w:hint="eastAsia"/>
+          <w:sz w:val="32"/>
+          <w:szCs w:val="32"/>
+          <w:lang w:eastAsia="zh-CN"/>
+        </w:rPr>
+        <w:t>实现</w:t>
+      </w:r>
+      <w:r>
+        <w:rPr>
+          <w:rFonts w:ascii="仿宋" w:eastAsia="仿宋" w:hAnsi="仿宋" w:hint="eastAsia"/>
+          <w:sz w:val="32"/>
+          <w:szCs w:val="32"/>
+          <w:lang w:eastAsia="zh-CN"/>
+        </w:rPr>
+        <w:t>代码外</w:t>
+      </w:r>
+      <w:r>
+        <w:rPr>
+          <w:rFonts w:ascii="仿宋" w:eastAsia="仿宋" w:hAnsi="仿宋" w:hint="eastAsia"/>
+          <w:sz w:val="32"/>
+          <w:szCs w:val="32"/>
+          <w:lang w:eastAsia="zh-CN"/>
+        </w:rPr>
+        <w:t>也要上传</w:t>
+      </w:r>
+      <w:r>
+        <w:rPr>
+          <w:rFonts w:ascii="仿宋" w:eastAsia="仿宋" w:hAnsi="仿宋" w:hint="eastAsia"/>
+          <w:sz w:val="32"/>
+          <w:szCs w:val="32"/>
+          <w:lang w:eastAsia="zh-CN"/>
+        </w:rPr>
+        <w:t>页面的</w:t>
+      </w:r>
+      <w:r>
+        <w:rPr>
+          <w:rFonts w:ascii="仿宋" w:eastAsia="仿宋" w:hAnsi="仿宋" w:hint="eastAsia"/>
+          <w:sz w:val="32"/>
+          <w:szCs w:val="32"/>
+          <w:lang w:eastAsia="zh-CN"/>
+        </w:rPr>
+        <w:t>完整页面截图方便老师查看完成效果</w:t>
+      </w:r>
+      <w:r>
+        <w:rPr>
+          <w:rFonts w:ascii="仿宋" w:eastAsia="仿宋" w:hAnsi="仿宋" w:hint="eastAsia"/>
+          <w:sz w:val="32"/>
+          <w:szCs w:val="32"/>
+          <w:lang w:eastAsia="zh-CN"/>
+        </w:rPr>
+        <w:t>。</w:t>
+      </w:r>
+      <w:r>
+        <w:rPr>
+          <w:rFonts w:ascii="仿宋" w:eastAsia="仿宋" w:hAnsi="仿宋" w:hint="eastAsia"/>
+          <w:sz w:val="32"/>
+          <w:szCs w:val="32"/>
+          <w:lang w:eastAsia="zh-CN"/>
+        </w:rPr>
+        <w:t>请同学们一定要在电脑上操作，第一步选择姓名和学号的时候不要跳过！否则后续可能出现404错误！</w:t>
+      </w:r>
+      <w:r>
+        <w:rPr>
+          <w:rFonts w:ascii="仿宋" w:eastAsia="仿宋" w:hAnsi="仿宋" w:hint="eastAsia"/>
+          <w:sz w:val="32"/>
+          <w:szCs w:val="32"/>
+          <w:lang w:eastAsia="zh-CN"/>
+        </w:rPr>
+        <w:t>推荐同学们使用AI工具进行编码，包括但不限于Claude</w:t>
+      </w:r>
+      <w:r>
+        <w:rPr>
+          <w:rFonts w:ascii="仿宋" w:eastAsia="仿宋" w:hAnsi="仿宋" w:hint="eastAsia"/>
+          <w:sz w:val="32"/>
+          <w:szCs w:val="32"/>
+          <w:lang w:eastAsia="zh-CN"/>
+        </w:rPr>
+        <w:t xml:space="preserve"> </w:t>
+      </w:r>
+      <w:r>
+        <w:rPr>
+          <w:rFonts w:ascii="仿宋" w:eastAsia="仿宋" w:hAnsi="仿宋" w:hint="eastAsia"/>
+          <w:sz w:val="32"/>
+          <w:szCs w:val="32"/>
+          <w:lang w:eastAsia="zh-CN"/>
+        </w:rPr>
+        <w:t>Code/Opencode/Trae/Cursor等；实验代码</w:t>
+      </w:r>
+      <w:r>
+        <w:rPr>
+          <w:rFonts w:ascii="仿宋" w:eastAsia="仿宋" w:hAnsi="仿宋" w:hint="eastAsia"/>
+          <w:sz w:val="32"/>
+          <w:szCs w:val="32"/>
+          <w:lang w:eastAsia="zh-CN"/>
+        </w:rPr>
+        <w:t>直接</w:t>
+      </w:r>
+      <w:r>
+        <w:rPr>
+          <w:rFonts w:ascii="仿宋" w:eastAsia="仿宋" w:hAnsi="仿宋" w:hint="eastAsia"/>
+          <w:sz w:val="32"/>
+          <w:szCs w:val="32"/>
+          <w:lang w:eastAsia="zh-CN"/>
+        </w:rPr>
+        <w:t>提交到</w:t>
+      </w:r>
+      <w:r>
+        <w:rPr>
+          <w:rFonts w:ascii="仿宋" w:eastAsia="仿宋" w:hAnsi="仿宋" w:hint="eastAsia"/>
+          <w:sz w:val="32"/>
+          <w:szCs w:val="32"/>
+          <w:lang w:eastAsia="zh-CN"/>
+        </w:rPr>
+        <w:t>作业仓库里</w:t>
+      </w:r>
+      <w:r>
+        <w:rPr>
+          <w:rFonts w:ascii="仿宋" w:eastAsia="仿宋" w:hAnsi="仿宋" w:hint="eastAsia"/>
+          <w:sz w:val="32"/>
+          <w:szCs w:val="32"/>
+          <w:lang w:eastAsia="zh-CN"/>
+        </w:rPr>
+        <w:t>。</w:t>
+      </w:r>
+    </w:p>
+    <w:p>
+      <w:pPr>
+        <w:rPr>
+          <w:rFonts w:ascii="仿宋" w:eastAsia="仿宋" w:hAnsi="仿宋" w:hint="eastAsia"/>
           <w:sz w:val="32"/>
           <w:szCs w:val="32"/>
           <w:lang w:eastAsia="zh-CN"/>
@@ -158,53 +452,6 @@
     <w:p>
       <w:pPr>
         <w:rPr>
-          <w:rFonts w:ascii="仿宋" w:eastAsia="仿宋" w:hAnsi="仿宋" w:hint="eastAsia"/>
-          <w:sz w:val="32"/>
-          <w:szCs w:val="32"/>
-          <w:lang w:eastAsia="zh-CN"/>
-        </w:rPr>
-      </w:pPr>
-      <w:r>
-        <w:rPr>
-          <w:rFonts w:ascii="仿宋" w:eastAsia="仿宋" w:hAnsi="仿宋" w:hint="eastAsia"/>
-          <w:sz w:val="32"/>
-          <w:szCs w:val="32"/>
-          <w:lang w:eastAsia="zh-CN"/>
-        </w:rPr>
-        <w:t>代码提交：请同学们直接通过</w:t>
-      </w:r>
-      <w:r>
-        <w:rPr>
-          <w:rFonts w:ascii="仿宋" w:eastAsia="仿宋" w:hAnsi="仿宋"/>
-          <w:sz w:val="32"/>
-          <w:szCs w:val="32"/>
-          <w:lang w:eastAsia="zh-CN"/>
-        </w:rPr>
-        <w:t>GitHub</w:t>
-      </w:r>
-      <w:r>
-        <w:rPr>
-          <w:rFonts w:ascii="仿宋" w:eastAsia="仿宋" w:hAnsi="仿宋" w:hint="eastAsia"/>
-          <w:sz w:val="32"/>
-          <w:szCs w:val="32"/>
-          <w:lang w:eastAsia="zh-CN"/>
-        </w:rPr>
-        <w:t xml:space="preserve"> Classroom提交实验过程代码。</w:t>
-      </w:r>
-    </w:p>
-    <w:p>
-      <w:pPr>
-        <w:rPr>
-          <w:rFonts w:ascii="仿宋" w:eastAsia="仿宋" w:hAnsi="仿宋"/>
-          <w:sz w:val="32"/>
-          <w:szCs w:val="32"/>
-          <w:lang w:eastAsia="zh-CN"/>
-        </w:rPr>
-      </w:pPr>
-    </w:p>
-    <w:p>
-      <w:pPr>
-        <w:rPr>
           <w:b/>
           <w:bCs/>
           <w:lang w:eastAsia="zh-CN"/>
@@ -217,7 +464,115 @@
           <w:szCs w:val="32"/>
           <w:lang w:eastAsia="zh-CN"/>
         </w:rPr>
-        <w:t>考核：在最后一次实验课上可以找我检查两个实验题目的效果，找我检查的学生的实验成绩会高于未经过检查的学生，实验成绩计入到平常成绩中。</w:t>
+        <w:t>实验</w:t>
+      </w:r>
+      <w:r>
+        <w:rPr>
+          <w:rFonts w:ascii="仿宋" w:eastAsia="仿宋" w:hAnsi="仿宋" w:hint="eastAsia"/>
+          <w:sz w:val="32"/>
+          <w:szCs w:val="32"/>
+          <w:lang w:eastAsia="zh-CN"/>
+        </w:rPr>
+        <w:t>考核</w:t>
+      </w:r>
+      <w:r>
+        <w:rPr>
+          <w:rFonts w:ascii="仿宋" w:eastAsia="仿宋" w:hAnsi="仿宋" w:hint="eastAsia"/>
+          <w:sz w:val="32"/>
+          <w:szCs w:val="32"/>
+          <w:lang w:eastAsia="zh-CN"/>
+        </w:rPr>
+        <w:t>：</w:t>
+      </w:r>
+      <w:r>
+        <w:rPr>
+          <w:rFonts w:ascii="仿宋" w:eastAsia="仿宋" w:hAnsi="仿宋" w:hint="eastAsia"/>
+          <w:sz w:val="32"/>
+          <w:szCs w:val="32"/>
+          <w:lang w:eastAsia="zh-CN"/>
+        </w:rPr>
+        <w:t>由两部分组成</w:t>
+      </w:r>
+      <w:r>
+        <w:rPr>
+          <w:rFonts w:ascii="仿宋" w:eastAsia="仿宋" w:hAnsi="仿宋" w:hint="eastAsia"/>
+          <w:sz w:val="32"/>
+          <w:szCs w:val="32"/>
+          <w:lang w:eastAsia="zh-CN"/>
+        </w:rPr>
+        <w:t>。第一部分，</w:t>
+      </w:r>
+      <w:r>
+        <w:rPr>
+          <w:rFonts w:ascii="仿宋" w:eastAsia="仿宋" w:hAnsi="仿宋" w:hint="eastAsia"/>
+          <w:sz w:val="32"/>
+          <w:szCs w:val="32"/>
+          <w:lang w:eastAsia="zh-CN"/>
+        </w:rPr>
+        <w:t>平常实验出勤</w:t>
+      </w:r>
+      <w:r>
+        <w:rPr>
+          <w:rFonts w:ascii="仿宋" w:eastAsia="仿宋" w:hAnsi="仿宋" w:hint="eastAsia"/>
+          <w:sz w:val="32"/>
+          <w:szCs w:val="32"/>
+          <w:lang w:eastAsia="zh-CN"/>
+        </w:rPr>
+        <w:t>考核</w:t>
+      </w:r>
+      <w:r>
+        <w:rPr>
+          <w:rFonts w:ascii="仿宋" w:eastAsia="仿宋" w:hAnsi="仿宋" w:hint="eastAsia"/>
+          <w:sz w:val="32"/>
+          <w:szCs w:val="32"/>
+          <w:lang w:eastAsia="zh-CN"/>
+        </w:rPr>
+        <w:t>及表现</w:t>
+      </w:r>
+      <w:r>
+        <w:rPr>
+          <w:rFonts w:ascii="仿宋" w:eastAsia="仿宋" w:hAnsi="仿宋" w:hint="eastAsia"/>
+          <w:sz w:val="32"/>
+          <w:szCs w:val="32"/>
+          <w:lang w:eastAsia="zh-CN"/>
+        </w:rPr>
+        <w:t>；</w:t>
+      </w:r>
+      <w:r>
+        <w:rPr>
+          <w:rFonts w:ascii="仿宋" w:eastAsia="仿宋" w:hAnsi="仿宋" w:hint="eastAsia"/>
+          <w:sz w:val="32"/>
+          <w:szCs w:val="32"/>
+          <w:lang w:eastAsia="zh-CN"/>
+        </w:rPr>
+        <w:t>第二部分，</w:t>
+      </w:r>
+      <w:r>
+        <w:rPr>
+          <w:rFonts w:ascii="仿宋" w:eastAsia="仿宋" w:hAnsi="仿宋" w:hint="eastAsia"/>
+          <w:sz w:val="32"/>
+          <w:szCs w:val="32"/>
+          <w:lang w:eastAsia="zh-CN"/>
+        </w:rPr>
+        <w:t>在最后一次实验课上可以找我检查</w:t>
+      </w:r>
+      <w:r>
+        <w:rPr>
+          <w:rFonts w:ascii="仿宋" w:eastAsia="仿宋" w:hAnsi="仿宋" w:hint="eastAsia"/>
+          <w:sz w:val="32"/>
+          <w:szCs w:val="32"/>
+          <w:lang w:eastAsia="zh-CN"/>
+        </w:rPr>
+        <w:t>三</w:t>
+      </w:r>
+      <w:r>
+        <w:rPr>
+          <w:rFonts w:ascii="仿宋" w:eastAsia="仿宋" w:hAnsi="仿宋" w:hint="eastAsia"/>
+          <w:sz w:val="32"/>
+          <w:szCs w:val="32"/>
+          <w:lang w:eastAsia="zh-CN"/>
+        </w:rPr>
+        <w:t>个题目的效果，找我检查的学生的实验成绩会高于未经过检查的学生，实验成绩计入到平常成绩中。</w:t>
       </w:r>
     </w:p>
     <w:p>
@@ -340,7 +695,7 @@
     <w:p>
       <w:pPr>
         <w:rPr>
-          <w:rFonts w:ascii="仿宋" w:eastAsia="仿宋" w:hAnsi="仿宋"/>
+          <w:rFonts w:ascii="仿宋" w:eastAsia="仿宋" w:hAnsi="仿宋" w:hint="eastAsia"/>
           <w:sz w:val="32"/>
           <w:szCs w:val="32"/>
           <w:lang w:eastAsia="zh-CN"/>
@@ -355,6 +710,15 @@
         </w:rPr>
         <w:lastRenderedPageBreak/>
         <w:t>目录：样式如下。每一章的撰写需包含4个要素的内容（任务目的、实验要求、实验过程与结果、心得体会）。</w:t>
+      </w:r>
+      <w:r>
+        <w:rPr>
+          <w:rFonts w:ascii="仿宋" w:eastAsia="仿宋" w:hAnsi="仿宋" w:hint="eastAsia"/>
+          <w:sz w:val="32"/>
+          <w:szCs w:val="32"/>
+          <w:lang w:eastAsia="zh-CN"/>
+        </w:rPr>
+        <w:t>实验过程中如果使用了AI请提交AI的提示词截图、组件结构图或者数据流说明图。</w:t>
       </w:r>
     </w:p>
     <w:p>
@@ -382,7 +746,25 @@
           <w:szCs w:val="32"/>
           <w:lang w:eastAsia="zh-CN"/>
         </w:rPr>
-        <w:t xml:space="preserve">个人信息卡片；实验2 </w:t>
+        <w:t>个人信息卡片；</w:t>
+      </w:r>
+      <w:r>
+        <w:rPr>
+          <w:rFonts w:ascii="仿宋" w:eastAsia="仿宋" w:hAnsi="仿宋" w:cs="宋体" w:hint="eastAsia"/>
+          <w:sz w:val="32"/>
+          <w:szCs w:val="32"/>
+          <w:lang w:eastAsia="zh-CN"/>
+        </w:rPr>
+        <w:t>实验2</w:t>
+      </w:r>
+      <w:r>
+        <w:rPr>
+          <w:rFonts w:ascii="仿宋" w:eastAsia="仿宋" w:hAnsi="仿宋" w:cs="宋体" w:hint="eastAsia"/>
+          <w:sz w:val="32"/>
+          <w:szCs w:val="32"/>
+          <w:lang w:eastAsia="zh-CN"/>
+        </w:rPr>
+        <w:t xml:space="preserve"> </w:t>
       </w:r>
       <w:r>
         <w:rPr>
@@ -709,16 +1091,34 @@
           <w:szCs w:val="32"/>
           <w:lang w:eastAsia="zh-CN"/>
         </w:rPr>
-        <w:t>年3月</w:t>
-      </w:r>
-      <w:r>
-        <w:rPr>
-          <w:rFonts w:ascii="仿宋" w:eastAsia="仿宋" w:hAnsi="仿宋" w:hint="eastAsia"/>
-          <w:sz w:val="32"/>
-          <w:szCs w:val="32"/>
-          <w:lang w:eastAsia="zh-CN"/>
-        </w:rPr>
-        <w:t>30</w:t>
+        <w:t>年</w:t>
+      </w:r>
+      <w:r>
+        <w:rPr>
+          <w:rFonts w:ascii="仿宋" w:eastAsia="仿宋" w:hAnsi="仿宋" w:hint="eastAsia"/>
+          <w:sz w:val="32"/>
+          <w:szCs w:val="32"/>
+          <w:lang w:eastAsia="zh-CN"/>
+        </w:rPr>
+        <w:t>4</w:t>
+      </w:r>
+      <w:r>
+        <w:rPr>
+          <w:rFonts w:ascii="仿宋" w:eastAsia="仿宋" w:hAnsi="仿宋" w:hint="eastAsia"/>
+          <w:sz w:val="32"/>
+          <w:szCs w:val="32"/>
+          <w:lang w:eastAsia="zh-CN"/>
+        </w:rPr>
+        <w:t>月</w:t>
+      </w:r>
+      <w:r>
+        <w:rPr>
+          <w:rFonts w:ascii="仿宋" w:eastAsia="仿宋" w:hAnsi="仿宋" w:hint="eastAsia"/>
+          <w:sz w:val="32"/>
+          <w:szCs w:val="32"/>
+          <w:lang w:eastAsia="zh-CN"/>
+        </w:rPr>
+        <w:t>3</w:t>
       </w:r>
       <w:r>
         <w:rPr>
@@ -1234,6 +1634,18 @@
       <w:u w:val="single"/>
     </w:rPr>
   </w:style>
+  <w:style w:type="paragraph" w:customStyle="1" w:styleId="p1">
+    <w:name w:val="p1"/>
+    <w:basedOn w:val="a"/>
+    <w:rsid w:val="00B375C1"/>
+    <w:pPr>
+      <w:spacing w:before="100" w:beforeAutospacing="1" w:after="100" w:afterAutospacing="1"/>
+    </w:pPr>
+    <w:rPr>
+      <w:rFonts w:ascii="宋体" w:eastAsia="宋体" w:hAnsi="宋体" w:cs="宋体"/>
+      <w:lang w:eastAsia="zh-CN"/>
+    </w:rPr>
+  </w:style>
 </w:styles>
 </file>
 

</xml_diff>

<commit_message>
update: modify 高级Web实验及实验报告 document and remove icon-bs-master.zip and workspace.xml files
</commit_message>
<xml_diff>
--- a/实验/2026/关于高级Web实验及实验报告.docx
+++ b/实验/2026/关于高级Web实验及实验报告.docx
@@ -45,7 +45,29 @@
           <w:szCs w:val="36"/>
           <w:lang w:eastAsia="zh-CN"/>
         </w:rPr>
-        <w:t>级实验及实验报告说明</w:t>
+        <w:t>级</w:t>
+      </w:r>
+      <w:r>
+        <w:rPr>
+          <w:rFonts w:ascii="仿宋" w:eastAsia="仿宋" w:hAnsi="仿宋" w:hint="eastAsia"/>
+          <w:b/>
+          <w:bCs/>
+          <w:sz w:val="36"/>
+          <w:szCs w:val="36"/>
+          <w:lang w:eastAsia="zh-CN"/>
+        </w:rPr>
+        <w:t>高级Web技术</w:t>
+      </w:r>
+      <w:r>
+        <w:rPr>
+          <w:rFonts w:ascii="仿宋" w:eastAsia="仿宋" w:hAnsi="仿宋" w:hint="eastAsia"/>
+          <w:b/>
+          <w:bCs/>
+          <w:sz w:val="36"/>
+          <w:szCs w:val="36"/>
+          <w:lang w:eastAsia="zh-CN"/>
+        </w:rPr>
+        <w:t>实验及实验报告说明</w:t>
       </w:r>
     </w:p>
     <w:p>
@@ -63,9 +85,6 @@
     <w:p>
       <w:pPr>
         <w:pStyle w:val="p1"/>
-        <w:rPr>
-          <w:rFonts w:hint="eastAsia"/>
-        </w:rPr>
       </w:pPr>
       <w:r>
         <w:rPr>
@@ -143,7 +162,7 @@
     <w:p>
       <w:pPr>
         <w:rPr>
-          <w:rFonts w:ascii="仿宋" w:eastAsia="仿宋" w:hAnsi="仿宋" w:hint="eastAsia"/>
+          <w:rFonts w:ascii="仿宋" w:eastAsia="仿宋" w:hAnsi="仿宋"/>
           <w:sz w:val="32"/>
           <w:szCs w:val="32"/>
           <w:lang w:eastAsia="zh-CN"/>
@@ -153,7 +172,7 @@
     <w:p>
       <w:pPr>
         <w:rPr>
-          <w:rFonts w:ascii="仿宋" w:eastAsia="仿宋" w:hAnsi="仿宋" w:hint="eastAsia"/>
+          <w:rFonts w:ascii="仿宋" w:eastAsia="仿宋" w:hAnsi="仿宋"/>
           <w:sz w:val="32"/>
           <w:szCs w:val="32"/>
           <w:lang w:eastAsia="zh-CN"/>
@@ -166,16 +185,7 @@
           <w:szCs w:val="32"/>
           <w:lang w:eastAsia="zh-CN"/>
         </w:rPr>
-        <w:t>实验环境</w:t>
-      </w:r>
-      <w:r>
-        <w:rPr>
-          <w:rFonts w:ascii="仿宋" w:eastAsia="仿宋" w:hAnsi="仿宋" w:hint="eastAsia"/>
-          <w:sz w:val="32"/>
-          <w:szCs w:val="32"/>
-          <w:lang w:eastAsia="zh-CN"/>
-        </w:rPr>
-        <w:t>：</w:t>
+        <w:t>实验环境：</w:t>
       </w:r>
       <w:r>
         <w:rPr>
@@ -247,16 +257,34 @@
           <w:szCs w:val="32"/>
           <w:lang w:eastAsia="zh-CN"/>
         </w:rPr>
-        <w:t>注册好了个人的Github账号后，</w:t>
-      </w:r>
-      <w:r>
-        <w:rPr>
-          <w:rFonts w:ascii="仿宋" w:eastAsia="仿宋" w:hAnsi="仿宋" w:hint="eastAsia"/>
-          <w:sz w:val="32"/>
-          <w:szCs w:val="32"/>
-          <w:lang w:eastAsia="zh-CN"/>
-        </w:rPr>
-        <w:t>请点击接收上面的作业，</w:t>
+        <w:t>注册好了个人的Github账号后，请点击接收上面的作业</w:t>
+      </w:r>
+      <w:r>
+        <w:rPr>
+          <w:rFonts w:ascii="仿宋" w:eastAsia="仿宋" w:hAnsi="仿宋" w:hint="eastAsia"/>
+          <w:sz w:val="32"/>
+          <w:szCs w:val="32"/>
+          <w:lang w:eastAsia="zh-CN"/>
+        </w:rPr>
+        <w:t>后</w:t>
+      </w:r>
+      <w:r>
+        <w:rPr>
+          <w:rFonts w:ascii="仿宋" w:eastAsia="仿宋" w:hAnsi="仿宋" w:hint="eastAsia"/>
+          <w:sz w:val="32"/>
+          <w:szCs w:val="32"/>
+          <w:lang w:eastAsia="zh-CN"/>
+        </w:rPr>
+        <w:t>，</w:t>
+      </w:r>
+      <w:r>
+        <w:rPr>
+          <w:rFonts w:ascii="仿宋" w:eastAsia="仿宋" w:hAnsi="仿宋" w:hint="eastAsia"/>
+          <w:sz w:val="32"/>
+          <w:szCs w:val="32"/>
+          <w:lang w:eastAsia="zh-CN"/>
+        </w:rPr>
+        <w:t>再在个人主页的收件箱里面接受作业。</w:t>
       </w:r>
       <w:r>
         <w:rPr>
@@ -274,96 +302,6 @@
           <w:szCs w:val="32"/>
           <w:lang w:eastAsia="zh-CN"/>
         </w:rPr>
-        <w:t>。第一个</w:t>
-      </w:r>
-      <w:r>
-        <w:rPr>
-          <w:rFonts w:ascii="仿宋" w:eastAsia="仿宋" w:hAnsi="仿宋" w:hint="eastAsia"/>
-          <w:sz w:val="32"/>
-          <w:szCs w:val="32"/>
-          <w:lang w:eastAsia="zh-CN"/>
-        </w:rPr>
-        <w:t>题目</w:t>
-      </w:r>
-      <w:r>
-        <w:rPr>
-          <w:rFonts w:ascii="仿宋" w:eastAsia="仿宋" w:hAnsi="仿宋" w:hint="eastAsia"/>
-          <w:sz w:val="32"/>
-          <w:szCs w:val="32"/>
-          <w:lang w:eastAsia="zh-CN"/>
-        </w:rPr>
-        <w:t>和第二个</w:t>
-      </w:r>
-      <w:r>
-        <w:rPr>
-          <w:rFonts w:ascii="仿宋" w:eastAsia="仿宋" w:hAnsi="仿宋" w:hint="eastAsia"/>
-          <w:sz w:val="32"/>
-          <w:szCs w:val="32"/>
-          <w:lang w:eastAsia="zh-CN"/>
-        </w:rPr>
-        <w:t>题目</w:t>
-      </w:r>
-      <w:r>
-        <w:rPr>
-          <w:rFonts w:ascii="仿宋" w:eastAsia="仿宋" w:hAnsi="仿宋" w:hint="eastAsia"/>
-          <w:sz w:val="32"/>
-          <w:szCs w:val="32"/>
-          <w:lang w:eastAsia="zh-CN"/>
-        </w:rPr>
-        <w:t>除了仓库中除了实验说明文档和</w:t>
-      </w:r>
-      <w:r>
-        <w:rPr>
-          <w:rFonts w:ascii="仿宋" w:eastAsia="仿宋" w:hAnsi="仿宋" w:hint="eastAsia"/>
-          <w:sz w:val="32"/>
-          <w:szCs w:val="32"/>
-          <w:lang w:eastAsia="zh-CN"/>
-        </w:rPr>
-        <w:t>实现</w:t>
-      </w:r>
-      <w:r>
-        <w:rPr>
-          <w:rFonts w:ascii="仿宋" w:eastAsia="仿宋" w:hAnsi="仿宋" w:hint="eastAsia"/>
-          <w:sz w:val="32"/>
-          <w:szCs w:val="32"/>
-          <w:lang w:eastAsia="zh-CN"/>
-        </w:rPr>
-        <w:t>代码外</w:t>
-      </w:r>
-      <w:r>
-        <w:rPr>
-          <w:rFonts w:ascii="仿宋" w:eastAsia="仿宋" w:hAnsi="仿宋" w:hint="eastAsia"/>
-          <w:sz w:val="32"/>
-          <w:szCs w:val="32"/>
-          <w:lang w:eastAsia="zh-CN"/>
-        </w:rPr>
-        <w:t>也要上传</w:t>
-      </w:r>
-      <w:r>
-        <w:rPr>
-          <w:rFonts w:ascii="仿宋" w:eastAsia="仿宋" w:hAnsi="仿宋" w:hint="eastAsia"/>
-          <w:sz w:val="32"/>
-          <w:szCs w:val="32"/>
-          <w:lang w:eastAsia="zh-CN"/>
-        </w:rPr>
-        <w:t>页面的</w:t>
-      </w:r>
-      <w:r>
-        <w:rPr>
-          <w:rFonts w:ascii="仿宋" w:eastAsia="仿宋" w:hAnsi="仿宋" w:hint="eastAsia"/>
-          <w:sz w:val="32"/>
-          <w:szCs w:val="32"/>
-          <w:lang w:eastAsia="zh-CN"/>
-        </w:rPr>
-        <w:t>完整页面截图方便老师查看完成效果</w:t>
-      </w:r>
-      <w:r>
-        <w:rPr>
-          <w:rFonts w:ascii="仿宋" w:eastAsia="仿宋" w:hAnsi="仿宋" w:hint="eastAsia"/>
-          <w:sz w:val="32"/>
-          <w:szCs w:val="32"/>
-          <w:lang w:eastAsia="zh-CN"/>
-        </w:rPr>
         <w:t>。</w:t>
       </w:r>
       <w:r>
@@ -382,25 +320,7 @@
           <w:szCs w:val="32"/>
           <w:lang w:eastAsia="zh-CN"/>
         </w:rPr>
-        <w:t>推荐同学们使用AI工具进行编码，包括但不限于Claude</w:t>
-      </w:r>
-      <w:r>
-        <w:rPr>
-          <w:rFonts w:ascii="仿宋" w:eastAsia="仿宋" w:hAnsi="仿宋" w:hint="eastAsia"/>
-          <w:sz w:val="32"/>
-          <w:szCs w:val="32"/>
-          <w:lang w:eastAsia="zh-CN"/>
-        </w:rPr>
-        <w:t xml:space="preserve"> </w:t>
-      </w:r>
-      <w:r>
-        <w:rPr>
-          <w:rFonts w:ascii="仿宋" w:eastAsia="仿宋" w:hAnsi="仿宋" w:hint="eastAsia"/>
-          <w:sz w:val="32"/>
-          <w:szCs w:val="32"/>
-          <w:lang w:eastAsia="zh-CN"/>
-        </w:rPr>
-        <w:t>Code/Opencode/Trae/Cursor等；实验代码</w:t>
+        <w:t>推荐同学们使用AI工具进行编码，包括但不限于Claude Code/Opencode/Trae/Cursor等；实验代码</w:t>
       </w:r>
       <w:r>
         <w:rPr>
@@ -428,6 +348,24 @@
           <w:lang w:eastAsia="zh-CN"/>
         </w:rPr>
         <w:t>作业仓库里</w:t>
+      </w:r>
+      <w:r>
+        <w:rPr>
+          <w:rFonts w:ascii="仿宋" w:eastAsia="仿宋" w:hAnsi="仿宋" w:hint="eastAsia"/>
+          <w:sz w:val="32"/>
+          <w:szCs w:val="32"/>
+          <w:lang w:eastAsia="zh-CN"/>
+        </w:rPr>
+        <w:t>，</w:t>
+      </w:r>
+      <w:r>
+        <w:rPr>
+          <w:rFonts w:ascii="仿宋" w:eastAsia="仿宋" w:hAnsi="仿宋" w:hint="eastAsia"/>
+          <w:sz w:val="32"/>
+          <w:szCs w:val="32"/>
+          <w:lang w:eastAsia="zh-CN"/>
+        </w:rPr>
+        <w:t>第一个题目可以上传页面的完整页面截图方便老师查看完成效果</w:t>
       </w:r>
       <w:r>
         <w:rPr>
@@ -442,7 +380,7 @@
     <w:p>
       <w:pPr>
         <w:rPr>
-          <w:rFonts w:ascii="仿宋" w:eastAsia="仿宋" w:hAnsi="仿宋" w:hint="eastAsia"/>
+          <w:rFonts w:ascii="仿宋" w:eastAsia="仿宋" w:hAnsi="仿宋"/>
           <w:sz w:val="32"/>
           <w:szCs w:val="32"/>
           <w:lang w:eastAsia="zh-CN"/>
@@ -464,16 +402,7 @@
           <w:szCs w:val="32"/>
           <w:lang w:eastAsia="zh-CN"/>
         </w:rPr>
-        <w:t>实验</w:t>
-      </w:r>
-      <w:r>
-        <w:rPr>
-          <w:rFonts w:ascii="仿宋" w:eastAsia="仿宋" w:hAnsi="仿宋" w:hint="eastAsia"/>
-          <w:sz w:val="32"/>
-          <w:szCs w:val="32"/>
-          <w:lang w:eastAsia="zh-CN"/>
-        </w:rPr>
-        <w:t>考核</w:t>
+        <w:t>实验考核</w:t>
       </w:r>
       <w:r>
         <w:rPr>
@@ -695,7 +624,7 @@
     <w:p>
       <w:pPr>
         <w:rPr>
-          <w:rFonts w:ascii="仿宋" w:eastAsia="仿宋" w:hAnsi="仿宋" w:hint="eastAsia"/>
+          <w:rFonts w:ascii="仿宋" w:eastAsia="仿宋" w:hAnsi="仿宋"/>
           <w:sz w:val="32"/>
           <w:szCs w:val="32"/>
           <w:lang w:eastAsia="zh-CN"/>
@@ -1118,7 +1047,7 @@
           <w:szCs w:val="32"/>
           <w:lang w:eastAsia="zh-CN"/>
         </w:rPr>
-        <w:t>3</w:t>
+        <w:t>15</w:t>
       </w:r>
       <w:r>
         <w:rPr>

</xml_diff>